<commit_message>
Remove Week 10 references after capstone folder deletion (root README, dataset docs)
Co-Authored-By: Claude Opus 4.8 (1M context) <noreply@anthropic.com>
</commit_message>
<xml_diff>
--- a/Summer of Claude.docx
+++ b/Summer of Claude.docx
@@ -12,6 +12,7 @@
           <w:rFonts w:ascii="Times New Roman" w:hAnsi="Times New Roman" w:cs="Times New Roman"/>
           <w:b/>
           <w:bCs/>
+          <w:color w:val="000000" w:themeColor="text1"/>
           <w:sz w:val="32"/>
           <w:szCs w:val="32"/>
           <w:u w:val="single"/>
@@ -23,6 +24,7 @@
           <w:rFonts w:ascii="Times New Roman" w:hAnsi="Times New Roman" w:cs="Times New Roman"/>
           <w:b/>
           <w:bCs/>
+          <w:color w:val="000000" w:themeColor="text1"/>
           <w:sz w:val="32"/>
           <w:szCs w:val="32"/>
           <w:u w:val="single"/>
@@ -37,6 +39,7 @@
         <w:spacing w:before="0" w:after="0"/>
         <w:rPr>
           <w:rFonts w:ascii="Times New Roman" w:hAnsi="Times New Roman" w:cs="Times New Roman"/>
+          <w:color w:val="000000" w:themeColor="text1"/>
         </w:rPr>
       </w:pPr>
     </w:p>
@@ -48,23 +51,27 @@
         <w:jc w:val="both"/>
         <w:rPr>
           <w:rFonts w:ascii="Times New Roman" w:hAnsi="Times New Roman" w:cs="Times New Roman"/>
-        </w:rPr>
-      </w:pPr>
-      <w:r>
-        <w:rPr>
-          <w:rFonts w:ascii="Times New Roman" w:hAnsi="Times New Roman" w:cs="Times New Roman"/>
+          <w:color w:val="000000" w:themeColor="text1"/>
+        </w:rPr>
+      </w:pPr>
+      <w:r>
+        <w:rPr>
+          <w:rFonts w:ascii="Times New Roman" w:hAnsi="Times New Roman" w:cs="Times New Roman"/>
+          <w:color w:val="000000" w:themeColor="text1"/>
         </w:rPr>
         <w:t xml:space="preserve">A 10-week professional development series for the lab. The goal is to get </w:t>
       </w:r>
       <w:r>
         <w:rPr>
           <w:rFonts w:ascii="Times New Roman" w:hAnsi="Times New Roman" w:cs="Times New Roman"/>
+          <w:color w:val="000000" w:themeColor="text1"/>
         </w:rPr>
         <w:t xml:space="preserve">you </w:t>
       </w:r>
       <w:r>
         <w:rPr>
           <w:rFonts w:ascii="Times New Roman" w:hAnsi="Times New Roman" w:cs="Times New Roman"/>
+          <w:color w:val="000000" w:themeColor="text1"/>
         </w:rPr>
         <w:t>fluent with AI coding tools (Claude Code and Codex) and, just as important, to build the habit of questioning, testing, and validating the code and analyses these tools produce so their outputs can be trusted.</w:t>
       </w:r>
@@ -77,6 +84,7 @@
         <w:jc w:val="both"/>
         <w:rPr>
           <w:rFonts w:ascii="Times New Roman" w:hAnsi="Times New Roman" w:cs="Times New Roman"/>
+          <w:color w:val="000000" w:themeColor="text1"/>
         </w:rPr>
       </w:pPr>
     </w:p>
@@ -88,23 +96,27 @@
         <w:jc w:val="both"/>
         <w:rPr>
           <w:rFonts w:ascii="Times New Roman" w:hAnsi="Times New Roman" w:cs="Times New Roman"/>
-        </w:rPr>
-      </w:pPr>
-      <w:r>
-        <w:rPr>
-          <w:rFonts w:ascii="Times New Roman" w:hAnsi="Times New Roman" w:cs="Times New Roman"/>
+          <w:color w:val="000000" w:themeColor="text1"/>
+        </w:rPr>
+      </w:pPr>
+      <w:r>
+        <w:rPr>
+          <w:rFonts w:ascii="Times New Roman" w:hAnsi="Times New Roman" w:cs="Times New Roman"/>
+          <w:color w:val="000000" w:themeColor="text1"/>
         </w:rPr>
         <w:t xml:space="preserve">Tool-agnostic by design. Most students will likely use Claude Code, but the principles transfer to Codex (and any agentic coding tool). </w:t>
       </w:r>
       <w:r>
         <w:rPr>
           <w:rFonts w:ascii="Times New Roman" w:hAnsi="Times New Roman" w:cs="Times New Roman"/>
+          <w:color w:val="000000" w:themeColor="text1"/>
         </w:rPr>
         <w:t xml:space="preserve">Learn </w:t>
       </w:r>
       <w:r>
         <w:rPr>
           <w:rFonts w:ascii="Times New Roman" w:hAnsi="Times New Roman" w:cs="Times New Roman"/>
+          <w:color w:val="000000" w:themeColor="text1"/>
         </w:rPr>
         <w:t>the behavior, not the button.</w:t>
       </w:r>
@@ -112,12 +124,14 @@
       <w:r>
         <w:rPr>
           <w:rFonts w:ascii="Times New Roman" w:hAnsi="Times New Roman" w:cs="Times New Roman"/>
+          <w:color w:val="000000" w:themeColor="text1"/>
         </w:rPr>
         <w:t xml:space="preserve"> </w:t>
       </w:r>
       <w:r>
         <w:rPr>
           <w:rFonts w:ascii="Times New Roman" w:hAnsi="Times New Roman" w:cs="Times New Roman"/>
+          <w:color w:val="000000" w:themeColor="text1"/>
         </w:rPr>
         <w:t>Two throughlines, every week</w:t>
       </w:r>
@@ -134,6 +148,7 @@
         <w:jc w:val="both"/>
         <w:rPr>
           <w:rFonts w:ascii="Times New Roman" w:hAnsi="Times New Roman" w:cs="Times New Roman"/>
+          <w:color w:val="000000" w:themeColor="text1"/>
         </w:rPr>
       </w:pPr>
       <w:r>
@@ -141,12 +156,14 @@
           <w:rFonts w:ascii="Times New Roman" w:hAnsi="Times New Roman" w:cs="Times New Roman"/>
           <w:b/>
           <w:bCs/>
+          <w:color w:val="000000" w:themeColor="text1"/>
         </w:rPr>
         <w:t>Vocabulary:</w:t>
       </w:r>
       <w:r>
         <w:rPr>
           <w:rFonts w:ascii="Times New Roman" w:hAnsi="Times New Roman" w:cs="Times New Roman"/>
+          <w:color w:val="000000" w:themeColor="text1"/>
         </w:rPr>
         <w:t xml:space="preserve"> demystify the jargon (agent, harness, tools, context, MCP, skills, slash commands, output styles, subagents, hooks) as each concept becomes useful.</w:t>
       </w:r>
@@ -163,6 +180,7 @@
         <w:jc w:val="both"/>
         <w:rPr>
           <w:rFonts w:ascii="Times New Roman" w:hAnsi="Times New Roman" w:cs="Times New Roman"/>
+          <w:color w:val="000000" w:themeColor="text1"/>
         </w:rPr>
       </w:pPr>
       <w:r>
@@ -170,12 +188,14 @@
           <w:rFonts w:ascii="Times New Roman" w:hAnsi="Times New Roman" w:cs="Times New Roman"/>
           <w:b/>
           <w:bCs/>
+          <w:color w:val="000000" w:themeColor="text1"/>
         </w:rPr>
         <w:t>Trust:</w:t>
       </w:r>
       <w:r>
         <w:rPr>
           <w:rFonts w:ascii="Times New Roman" w:hAnsi="Times New Roman" w:cs="Times New Roman"/>
+          <w:color w:val="000000" w:themeColor="text1"/>
         </w:rPr>
         <w:t xml:space="preserve"> never accept generated code or analysis at face value. Learn the questions to </w:t>
       </w:r>
@@ -183,6 +203,7 @@
       <w:r>
         <w:rPr>
           <w:rFonts w:ascii="Times New Roman" w:hAnsi="Times New Roman" w:cs="Times New Roman"/>
+          <w:color w:val="000000" w:themeColor="text1"/>
         </w:rPr>
         <w:t>ask, and</w:t>
       </w:r>
@@ -190,6 +211,7 @@
       <w:r>
         <w:rPr>
           <w:rFonts w:ascii="Times New Roman" w:hAnsi="Times New Roman" w:cs="Times New Roman"/>
+          <w:color w:val="000000" w:themeColor="text1"/>
         </w:rPr>
         <w:t xml:space="preserve"> encode those questions into skills so the agent asks them every time.</w:t>
       </w:r>
@@ -202,6 +224,7 @@
         <w:jc w:val="both"/>
         <w:rPr>
           <w:rFonts w:ascii="Times New Roman" w:hAnsi="Times New Roman" w:cs="Times New Roman"/>
+          <w:color w:val="000000" w:themeColor="text1"/>
           <w:sz w:val="24"/>
           <w:szCs w:val="24"/>
         </w:rPr>
@@ -217,6 +240,7 @@
         <w:jc w:val="both"/>
         <w:rPr>
           <w:rFonts w:ascii="Times New Roman" w:hAnsi="Times New Roman" w:cs="Times New Roman"/>
+          <w:color w:val="000000" w:themeColor="text1"/>
           <w:sz w:val="24"/>
           <w:szCs w:val="24"/>
         </w:rPr>
@@ -224,211 +248,119 @@
       <w:r>
         <w:rPr>
           <w:rFonts w:ascii="Times New Roman" w:hAnsi="Times New Roman" w:cs="Times New Roman"/>
+          <w:color w:val="000000" w:themeColor="text1"/>
           <w:sz w:val="24"/>
           <w:szCs w:val="24"/>
         </w:rPr>
-        <w:t>L</w:t>
-      </w:r>
-      <w:r>
-        <w:rPr>
-          <w:rFonts w:ascii="Times New Roman" w:hAnsi="Times New Roman" w:cs="Times New Roman"/>
+        <w:t>Learning modes</w:t>
+      </w:r>
+      <w:r>
+        <w:rPr>
+          <w:rFonts w:ascii="Times New Roman" w:hAnsi="Times New Roman" w:cs="Times New Roman"/>
+          <w:color w:val="000000" w:themeColor="text1"/>
           <w:sz w:val="24"/>
           <w:szCs w:val="24"/>
         </w:rPr>
-        <w:t>earning modes</w:t>
-      </w:r>
-      <w:r>
-        <w:rPr>
-          <w:rFonts w:ascii="Times New Roman" w:hAnsi="Times New Roman" w:cs="Times New Roman"/>
+        <w:t xml:space="preserve">: </w:t>
+      </w:r>
+      <w:r>
+        <w:rPr>
+          <w:rFonts w:ascii="Times New Roman" w:hAnsi="Times New Roman" w:cs="Times New Roman"/>
+          <w:color w:val="000000" w:themeColor="text1"/>
           <w:sz w:val="24"/>
           <w:szCs w:val="24"/>
         </w:rPr>
-        <w:t xml:space="preserve">: </w:t>
-      </w:r>
-      <w:r>
-        <w:rPr>
-          <w:rFonts w:ascii="Times New Roman" w:hAnsi="Times New Roman" w:cs="Times New Roman"/>
+        <w:t xml:space="preserve">Claude Code ships two teaching modes. </w:t>
+      </w:r>
+      <w:r>
+        <w:rPr>
+          <w:rFonts w:ascii="Times New Roman" w:hAnsi="Times New Roman" w:cs="Times New Roman"/>
+          <w:b/>
+          <w:bCs/>
+          <w:color w:val="000000" w:themeColor="text1"/>
           <w:sz w:val="24"/>
           <w:szCs w:val="24"/>
         </w:rPr>
-        <w:t xml:space="preserve">Claude Code ships two teaching modes. </w:t>
+        <w:t>Explanatory</w:t>
+      </w:r>
+      <w:r>
+        <w:rPr>
+          <w:rFonts w:ascii="Times New Roman" w:hAnsi="Times New Roman" w:cs="Times New Roman"/>
+          <w:color w:val="000000" w:themeColor="text1"/>
+          <w:sz w:val="24"/>
+          <w:szCs w:val="24"/>
+        </w:rPr>
+        <w:t xml:space="preserve"> narrates its reasoning while it does all the work; no code required. </w:t>
       </w:r>
       <w:r>
         <w:rPr>
           <w:rFonts w:ascii="Times New Roman" w:hAnsi="Times New Roman" w:cs="Times New Roman"/>
           <w:b/>
           <w:bCs/>
+          <w:color w:val="000000" w:themeColor="text1"/>
           <w:sz w:val="24"/>
           <w:szCs w:val="24"/>
         </w:rPr>
-        <w:t>Explanatory</w:t>
-      </w:r>
-      <w:r>
-        <w:rPr>
-          <w:rFonts w:ascii="Times New Roman" w:hAnsi="Times New Roman" w:cs="Times New Roman"/>
+        <w:t>Learning</w:t>
+      </w:r>
+      <w:r>
+        <w:rPr>
+          <w:rFonts w:ascii="Times New Roman" w:hAnsi="Times New Roman" w:cs="Times New Roman"/>
+          <w:color w:val="000000" w:themeColor="text1"/>
           <w:sz w:val="24"/>
           <w:szCs w:val="24"/>
         </w:rPr>
-        <w:t xml:space="preserve"> narrates its reasoning while it does all the work; no code required. </w:t>
-      </w:r>
-      <w:r>
-        <w:rPr>
-          <w:rFonts w:ascii="Times New Roman" w:hAnsi="Times New Roman" w:cs="Times New Roman"/>
-          <w:b/>
-          <w:bCs/>
+        <w:t xml:space="preserve"> is learn-by-doing. It leaves </w:t>
+      </w:r>
+      <w:proofErr w:type="gramStart"/>
+      <w:r>
+        <w:rPr>
+          <w:rStyle w:val="VerbatimChar"/>
+          <w:rFonts w:ascii="Times New Roman" w:hAnsi="Times New Roman" w:cs="Times New Roman"/>
+          <w:color w:val="000000" w:themeColor="text1"/>
           <w:sz w:val="24"/>
           <w:szCs w:val="24"/>
         </w:rPr>
-        <w:t>Learning</w:t>
-      </w:r>
-      <w:r>
-        <w:rPr>
-          <w:rFonts w:ascii="Times New Roman" w:hAnsi="Times New Roman" w:cs="Times New Roman"/>
+        <w:t>TODO(</w:t>
+      </w:r>
+      <w:proofErr w:type="gramEnd"/>
+      <w:r>
+        <w:rPr>
+          <w:rStyle w:val="VerbatimChar"/>
+          <w:rFonts w:ascii="Times New Roman" w:hAnsi="Times New Roman" w:cs="Times New Roman"/>
+          <w:color w:val="000000" w:themeColor="text1"/>
           <w:sz w:val="24"/>
           <w:szCs w:val="24"/>
         </w:rPr>
-        <w:t xml:space="preserve"> is learn-by-doing</w:t>
-      </w:r>
-      <w:r>
-        <w:rPr>
-          <w:rFonts w:ascii="Times New Roman" w:hAnsi="Times New Roman" w:cs="Times New Roman"/>
+        <w:t>human)</w:t>
+      </w:r>
+      <w:r>
+        <w:rPr>
+          <w:rFonts w:ascii="Times New Roman" w:hAnsi="Times New Roman" w:cs="Times New Roman"/>
+          <w:color w:val="000000" w:themeColor="text1"/>
           <w:sz w:val="24"/>
           <w:szCs w:val="24"/>
         </w:rPr>
-        <w:t>.</w:t>
-      </w:r>
-      <w:r>
-        <w:rPr>
-          <w:rFonts w:ascii="Times New Roman" w:hAnsi="Times New Roman" w:cs="Times New Roman"/>
+        <w:t xml:space="preserve"> markers for you to fill in. Never-coded students should start in Explanatory and graduate to Learning around Week 4. Switching is one line (</w:t>
+      </w:r>
+      <w:r>
+        <w:rPr>
+          <w:rStyle w:val="VerbatimChar"/>
+          <w:rFonts w:ascii="Times New Roman" w:hAnsi="Times New Roman" w:cs="Times New Roman"/>
+          <w:color w:val="000000" w:themeColor="text1"/>
           <w:sz w:val="24"/>
           <w:szCs w:val="24"/>
         </w:rPr>
-        <w:t xml:space="preserve"> </w:t>
-      </w:r>
-      <w:r>
-        <w:rPr>
-          <w:rFonts w:ascii="Times New Roman" w:hAnsi="Times New Roman" w:cs="Times New Roman"/>
+        <w:t>/config</w:t>
+      </w:r>
+      <w:r>
+        <w:rPr>
+          <w:rFonts w:ascii="Times New Roman" w:hAnsi="Times New Roman" w:cs="Times New Roman"/>
+          <w:color w:val="000000" w:themeColor="text1"/>
           <w:sz w:val="24"/>
           <w:szCs w:val="24"/>
         </w:rPr>
-        <w:t>I</w:t>
-      </w:r>
-      <w:r>
-        <w:rPr>
-          <w:rFonts w:ascii="Times New Roman" w:hAnsi="Times New Roman" w:cs="Times New Roman"/>
-          <w:sz w:val="24"/>
-          <w:szCs w:val="24"/>
-        </w:rPr>
-        <w:t xml:space="preserve">t leaves </w:t>
-      </w:r>
-      <w:proofErr w:type="gramStart"/>
-      <w:r>
-        <w:rPr>
-          <w:rStyle w:val="VerbatimChar"/>
-          <w:rFonts w:ascii="Times New Roman" w:hAnsi="Times New Roman" w:cs="Times New Roman"/>
-          <w:sz w:val="24"/>
-          <w:szCs w:val="24"/>
-        </w:rPr>
-        <w:t>TODO(</w:t>
-      </w:r>
-      <w:proofErr w:type="gramEnd"/>
-      <w:r>
-        <w:rPr>
-          <w:rStyle w:val="VerbatimChar"/>
-          <w:rFonts w:ascii="Times New Roman" w:hAnsi="Times New Roman" w:cs="Times New Roman"/>
-          <w:sz w:val="24"/>
-          <w:szCs w:val="24"/>
-        </w:rPr>
-        <w:t>human)</w:t>
-      </w:r>
-      <w:r>
-        <w:rPr>
-          <w:rFonts w:ascii="Times New Roman" w:hAnsi="Times New Roman" w:cs="Times New Roman"/>
-          <w:sz w:val="24"/>
-          <w:szCs w:val="24"/>
-        </w:rPr>
-        <w:t xml:space="preserve"> markers for </w:t>
-      </w:r>
-      <w:r>
-        <w:rPr>
-          <w:rFonts w:ascii="Times New Roman" w:hAnsi="Times New Roman" w:cs="Times New Roman"/>
-          <w:sz w:val="24"/>
-          <w:szCs w:val="24"/>
-        </w:rPr>
-        <w:t xml:space="preserve">you </w:t>
-      </w:r>
-      <w:r>
-        <w:rPr>
-          <w:rFonts w:ascii="Times New Roman" w:hAnsi="Times New Roman" w:cs="Times New Roman"/>
-          <w:sz w:val="24"/>
-          <w:szCs w:val="24"/>
-        </w:rPr>
-        <w:t xml:space="preserve">to fill in. Never-coded students </w:t>
-      </w:r>
-      <w:r>
-        <w:rPr>
-          <w:rFonts w:ascii="Times New Roman" w:hAnsi="Times New Roman" w:cs="Times New Roman"/>
-          <w:sz w:val="24"/>
-          <w:szCs w:val="24"/>
-        </w:rPr>
-        <w:t xml:space="preserve">should </w:t>
-      </w:r>
-      <w:r>
-        <w:rPr>
-          <w:rFonts w:ascii="Times New Roman" w:hAnsi="Times New Roman" w:cs="Times New Roman"/>
-          <w:sz w:val="24"/>
-          <w:szCs w:val="24"/>
-        </w:rPr>
-        <w:t>start in Explanatory and graduate to Learning around Week 4. Switching is one line (</w:t>
-      </w:r>
-      <w:r>
-        <w:rPr>
-          <w:rStyle w:val="VerbatimChar"/>
-          <w:rFonts w:ascii="Times New Roman" w:hAnsi="Times New Roman" w:cs="Times New Roman"/>
-          <w:sz w:val="24"/>
-          <w:szCs w:val="24"/>
-        </w:rPr>
-        <w:t>/config</w:t>
-      </w:r>
-      <w:r>
-        <w:rPr>
-          <w:rFonts w:ascii="Times New Roman" w:hAnsi="Times New Roman" w:cs="Times New Roman"/>
-          <w:sz w:val="24"/>
-          <w:szCs w:val="24"/>
-        </w:rPr>
-        <w:t xml:space="preserve"> -&gt; Output style). Codex has no toggle, but prompting </w:t>
-      </w:r>
-      <w:r>
-        <w:rPr>
-          <w:rFonts w:ascii="Times New Roman" w:hAnsi="Times New Roman" w:cs="Times New Roman"/>
-          <w:sz w:val="24"/>
-          <w:szCs w:val="24"/>
-        </w:rPr>
-        <w:t xml:space="preserve">can </w:t>
-      </w:r>
-      <w:r>
-        <w:rPr>
-          <w:rFonts w:ascii="Times New Roman" w:hAnsi="Times New Roman" w:cs="Times New Roman"/>
-          <w:sz w:val="24"/>
-          <w:szCs w:val="24"/>
-        </w:rPr>
-        <w:t>reproduce</w:t>
-      </w:r>
-      <w:r>
-        <w:rPr>
-          <w:rFonts w:ascii="Times New Roman" w:hAnsi="Times New Roman" w:cs="Times New Roman"/>
-          <w:sz w:val="24"/>
-          <w:szCs w:val="24"/>
-        </w:rPr>
-        <w:t xml:space="preserve"> </w:t>
-      </w:r>
-      <w:r>
-        <w:rPr>
-          <w:rFonts w:ascii="Times New Roman" w:hAnsi="Times New Roman" w:cs="Times New Roman"/>
-          <w:sz w:val="24"/>
-          <w:szCs w:val="24"/>
-        </w:rPr>
-        <w:t>both modes.</w:t>
+        <w:t xml:space="preserve"> -&gt; Output style). Codex has no toggle, but prompting can reproduce both modes.</w:t>
       </w:r>
     </w:p>
     <w:p>
@@ -440,6 +372,7 @@
           <w:rFonts w:ascii="Times New Roman" w:hAnsi="Times New Roman" w:cs="Times New Roman"/>
           <w:b/>
           <w:bCs/>
+          <w:color w:val="000000" w:themeColor="text1"/>
           <w:sz w:val="24"/>
           <w:szCs w:val="24"/>
           <w:u w:val="single"/>
@@ -489,6 +422,7 @@
                 <w:rFonts w:ascii="Times New Roman" w:hAnsi="Times New Roman" w:cs="Times New Roman"/>
                 <w:b/>
                 <w:bCs/>
+                <w:color w:val="000000" w:themeColor="text1"/>
               </w:rPr>
             </w:pPr>
             <w:r>
@@ -496,6 +430,7 @@
                 <w:rFonts w:ascii="Times New Roman" w:hAnsi="Times New Roman" w:cs="Times New Roman"/>
                 <w:b/>
                 <w:bCs/>
+                <w:color w:val="000000" w:themeColor="text1"/>
               </w:rPr>
               <w:t>W</w:t>
             </w:r>
@@ -504,6 +439,7 @@
                 <w:rFonts w:ascii="Times New Roman" w:hAnsi="Times New Roman" w:cs="Times New Roman"/>
                 <w:b/>
                 <w:bCs/>
+                <w:color w:val="000000" w:themeColor="text1"/>
               </w:rPr>
               <w:t>ee</w:t>
             </w:r>
@@ -512,6 +448,7 @@
                 <w:rFonts w:ascii="Times New Roman" w:hAnsi="Times New Roman" w:cs="Times New Roman"/>
                 <w:b/>
                 <w:bCs/>
+                <w:color w:val="000000" w:themeColor="text1"/>
               </w:rPr>
               <w:t>k</w:t>
             </w:r>
@@ -536,6 +473,7 @@
                 <w:rFonts w:ascii="Times New Roman" w:hAnsi="Times New Roman" w:cs="Times New Roman"/>
                 <w:b/>
                 <w:bCs/>
+                <w:color w:val="000000" w:themeColor="text1"/>
               </w:rPr>
             </w:pPr>
             <w:r>
@@ -543,6 +481,7 @@
                 <w:rFonts w:ascii="Times New Roman" w:hAnsi="Times New Roman" w:cs="Times New Roman"/>
                 <w:b/>
                 <w:bCs/>
+                <w:color w:val="000000" w:themeColor="text1"/>
               </w:rPr>
               <w:t>Topic</w:t>
             </w:r>
@@ -567,6 +506,7 @@
                 <w:rFonts w:ascii="Times New Roman" w:hAnsi="Times New Roman" w:cs="Times New Roman"/>
                 <w:b/>
                 <w:bCs/>
+                <w:color w:val="000000" w:themeColor="text1"/>
               </w:rPr>
             </w:pPr>
             <w:r>
@@ -574,6 +514,7 @@
                 <w:rFonts w:ascii="Times New Roman" w:hAnsi="Times New Roman" w:cs="Times New Roman"/>
                 <w:b/>
                 <w:bCs/>
+                <w:color w:val="000000" w:themeColor="text1"/>
               </w:rPr>
               <w:t>Focus</w:t>
             </w:r>
@@ -600,6 +541,7 @@
               <w:jc w:val="center"/>
               <w:rPr>
                 <w:rFonts w:ascii="Times New Roman" w:hAnsi="Times New Roman" w:cs="Times New Roman"/>
+                <w:color w:val="000000" w:themeColor="text1"/>
                 <w:sz w:val="22"/>
                 <w:szCs w:val="22"/>
               </w:rPr>
@@ -607,6 +549,7 @@
             <w:r>
               <w:rPr>
                 <w:rFonts w:ascii="Times New Roman" w:hAnsi="Times New Roman" w:cs="Times New Roman"/>
+                <w:color w:val="000000" w:themeColor="text1"/>
                 <w:sz w:val="22"/>
                 <w:szCs w:val="22"/>
               </w:rPr>
@@ -630,6 +573,7 @@
               <w:jc w:val="center"/>
               <w:rPr>
                 <w:rFonts w:ascii="Times New Roman" w:hAnsi="Times New Roman" w:cs="Times New Roman"/>
+                <w:color w:val="000000" w:themeColor="text1"/>
                 <w:sz w:val="22"/>
                 <w:szCs w:val="22"/>
               </w:rPr>
@@ -637,6 +581,7 @@
             <w:r>
               <w:rPr>
                 <w:rFonts w:ascii="Times New Roman" w:hAnsi="Times New Roman" w:cs="Times New Roman"/>
+                <w:color w:val="000000" w:themeColor="text1"/>
                 <w:sz w:val="22"/>
                 <w:szCs w:val="22"/>
               </w:rPr>
@@ -660,6 +605,7 @@
               <w:jc w:val="center"/>
               <w:rPr>
                 <w:rFonts w:ascii="Times New Roman" w:hAnsi="Times New Roman" w:cs="Times New Roman"/>
+                <w:color w:val="000000" w:themeColor="text1"/>
                 <w:sz w:val="22"/>
                 <w:szCs w:val="22"/>
               </w:rPr>
@@ -667,6 +613,7 @@
             <w:r>
               <w:rPr>
                 <w:rFonts w:ascii="Times New Roman" w:hAnsi="Times New Roman" w:cs="Times New Roman"/>
+                <w:color w:val="000000" w:themeColor="text1"/>
                 <w:sz w:val="22"/>
                 <w:szCs w:val="22"/>
               </w:rPr>
@@ -692,6 +639,7 @@
               <w:jc w:val="center"/>
               <w:rPr>
                 <w:rFonts w:ascii="Times New Roman" w:hAnsi="Times New Roman" w:cs="Times New Roman"/>
+                <w:color w:val="000000" w:themeColor="text1"/>
                 <w:sz w:val="22"/>
                 <w:szCs w:val="22"/>
               </w:rPr>
@@ -699,6 +647,7 @@
             <w:r>
               <w:rPr>
                 <w:rFonts w:ascii="Times New Roman" w:hAnsi="Times New Roman" w:cs="Times New Roman"/>
+                <w:color w:val="000000" w:themeColor="text1"/>
                 <w:sz w:val="22"/>
                 <w:szCs w:val="22"/>
               </w:rPr>
@@ -719,6 +668,7 @@
               <w:jc w:val="center"/>
               <w:rPr>
                 <w:rFonts w:ascii="Times New Roman" w:hAnsi="Times New Roman" w:cs="Times New Roman"/>
+                <w:color w:val="000000" w:themeColor="text1"/>
                 <w:sz w:val="22"/>
                 <w:szCs w:val="22"/>
               </w:rPr>
@@ -726,6 +676,7 @@
             <w:r>
               <w:rPr>
                 <w:rFonts w:ascii="Times New Roman" w:hAnsi="Times New Roman" w:cs="Times New Roman"/>
+                <w:color w:val="000000" w:themeColor="text1"/>
                 <w:sz w:val="22"/>
                 <w:szCs w:val="22"/>
               </w:rPr>
@@ -746,6 +697,7 @@
               <w:jc w:val="center"/>
               <w:rPr>
                 <w:rFonts w:ascii="Times New Roman" w:hAnsi="Times New Roman" w:cs="Times New Roman"/>
+                <w:color w:val="000000" w:themeColor="text1"/>
                 <w:sz w:val="22"/>
                 <w:szCs w:val="22"/>
               </w:rPr>
@@ -753,6 +705,7 @@
             <w:r>
               <w:rPr>
                 <w:rFonts w:ascii="Times New Roman" w:hAnsi="Times New Roman" w:cs="Times New Roman"/>
+                <w:color w:val="000000" w:themeColor="text1"/>
                 <w:sz w:val="22"/>
                 <w:szCs w:val="22"/>
               </w:rPr>
@@ -778,6 +731,7 @@
               <w:jc w:val="center"/>
               <w:rPr>
                 <w:rFonts w:ascii="Times New Roman" w:hAnsi="Times New Roman" w:cs="Times New Roman"/>
+                <w:color w:val="000000" w:themeColor="text1"/>
                 <w:sz w:val="22"/>
                 <w:szCs w:val="22"/>
               </w:rPr>
@@ -785,6 +739,7 @@
             <w:r>
               <w:rPr>
                 <w:rFonts w:ascii="Times New Roman" w:hAnsi="Times New Roman" w:cs="Times New Roman"/>
+                <w:color w:val="000000" w:themeColor="text1"/>
                 <w:sz w:val="22"/>
                 <w:szCs w:val="22"/>
               </w:rPr>
@@ -805,6 +760,7 @@
               <w:jc w:val="center"/>
               <w:rPr>
                 <w:rFonts w:ascii="Times New Roman" w:hAnsi="Times New Roman" w:cs="Times New Roman"/>
+                <w:color w:val="000000" w:themeColor="text1"/>
                 <w:sz w:val="22"/>
                 <w:szCs w:val="22"/>
               </w:rPr>
@@ -812,6 +768,7 @@
             <w:r>
               <w:rPr>
                 <w:rFonts w:ascii="Times New Roman" w:hAnsi="Times New Roman" w:cs="Times New Roman"/>
+                <w:color w:val="000000" w:themeColor="text1"/>
                 <w:sz w:val="22"/>
                 <w:szCs w:val="22"/>
               </w:rPr>
@@ -832,6 +789,7 @@
               <w:jc w:val="center"/>
               <w:rPr>
                 <w:rFonts w:ascii="Times New Roman" w:hAnsi="Times New Roman" w:cs="Times New Roman"/>
+                <w:color w:val="000000" w:themeColor="text1"/>
                 <w:sz w:val="22"/>
                 <w:szCs w:val="22"/>
               </w:rPr>
@@ -839,6 +797,7 @@
             <w:r>
               <w:rPr>
                 <w:rFonts w:ascii="Times New Roman" w:hAnsi="Times New Roman" w:cs="Times New Roman"/>
+                <w:color w:val="000000" w:themeColor="text1"/>
                 <w:sz w:val="22"/>
                 <w:szCs w:val="22"/>
               </w:rPr>
@@ -847,6 +806,7 @@
             <w:r>
               <w:rPr>
                 <w:rFonts w:ascii="Times New Roman" w:hAnsi="Times New Roman" w:cs="Times New Roman"/>
+                <w:color w:val="000000" w:themeColor="text1"/>
                 <w:sz w:val="22"/>
                 <w:szCs w:val="22"/>
               </w:rPr>
@@ -855,6 +815,7 @@
             <w:r>
               <w:rPr>
                 <w:rFonts w:ascii="Times New Roman" w:hAnsi="Times New Roman" w:cs="Times New Roman"/>
+                <w:color w:val="000000" w:themeColor="text1"/>
                 <w:sz w:val="22"/>
                 <w:szCs w:val="22"/>
               </w:rPr>
@@ -880,6 +841,7 @@
               <w:jc w:val="center"/>
               <w:rPr>
                 <w:rFonts w:ascii="Times New Roman" w:hAnsi="Times New Roman" w:cs="Times New Roman"/>
+                <w:color w:val="000000" w:themeColor="text1"/>
                 <w:sz w:val="22"/>
                 <w:szCs w:val="22"/>
               </w:rPr>
@@ -887,6 +849,7 @@
             <w:r>
               <w:rPr>
                 <w:rFonts w:ascii="Times New Roman" w:hAnsi="Times New Roman" w:cs="Times New Roman"/>
+                <w:color w:val="000000" w:themeColor="text1"/>
                 <w:sz w:val="22"/>
                 <w:szCs w:val="22"/>
               </w:rPr>
@@ -907,6 +870,7 @@
               <w:jc w:val="center"/>
               <w:rPr>
                 <w:rFonts w:ascii="Times New Roman" w:hAnsi="Times New Roman" w:cs="Times New Roman"/>
+                <w:color w:val="000000" w:themeColor="text1"/>
                 <w:sz w:val="22"/>
                 <w:szCs w:val="22"/>
               </w:rPr>
@@ -914,6 +878,7 @@
             <w:r>
               <w:rPr>
                 <w:rFonts w:ascii="Times New Roman" w:hAnsi="Times New Roman" w:cs="Times New Roman"/>
+                <w:color w:val="000000" w:themeColor="text1"/>
                 <w:sz w:val="22"/>
                 <w:szCs w:val="22"/>
               </w:rPr>
@@ -934,6 +899,7 @@
               <w:jc w:val="center"/>
               <w:rPr>
                 <w:rFonts w:ascii="Times New Roman" w:hAnsi="Times New Roman" w:cs="Times New Roman"/>
+                <w:color w:val="000000" w:themeColor="text1"/>
                 <w:sz w:val="22"/>
                 <w:szCs w:val="22"/>
               </w:rPr>
@@ -941,6 +907,7 @@
             <w:r>
               <w:rPr>
                 <w:rFonts w:ascii="Times New Roman" w:hAnsi="Times New Roman" w:cs="Times New Roman"/>
+                <w:color w:val="000000" w:themeColor="text1"/>
                 <w:sz w:val="22"/>
                 <w:szCs w:val="22"/>
               </w:rPr>
@@ -966,6 +933,7 @@
               <w:jc w:val="center"/>
               <w:rPr>
                 <w:rFonts w:ascii="Times New Roman" w:hAnsi="Times New Roman" w:cs="Times New Roman"/>
+                <w:color w:val="000000" w:themeColor="text1"/>
                 <w:sz w:val="22"/>
                 <w:szCs w:val="22"/>
               </w:rPr>
@@ -973,6 +941,7 @@
             <w:r>
               <w:rPr>
                 <w:rFonts w:ascii="Times New Roman" w:hAnsi="Times New Roman" w:cs="Times New Roman"/>
+                <w:color w:val="000000" w:themeColor="text1"/>
                 <w:sz w:val="22"/>
                 <w:szCs w:val="22"/>
               </w:rPr>
@@ -993,6 +962,7 @@
               <w:jc w:val="center"/>
               <w:rPr>
                 <w:rFonts w:ascii="Times New Roman" w:hAnsi="Times New Roman" w:cs="Times New Roman"/>
+                <w:color w:val="000000" w:themeColor="text1"/>
                 <w:sz w:val="22"/>
                 <w:szCs w:val="22"/>
               </w:rPr>
@@ -1000,6 +970,7 @@
             <w:r>
               <w:rPr>
                 <w:rFonts w:ascii="Times New Roman" w:hAnsi="Times New Roman" w:cs="Times New Roman"/>
+                <w:color w:val="000000" w:themeColor="text1"/>
                 <w:sz w:val="22"/>
                 <w:szCs w:val="22"/>
               </w:rPr>
@@ -1020,6 +991,7 @@
               <w:jc w:val="center"/>
               <w:rPr>
                 <w:rFonts w:ascii="Times New Roman" w:hAnsi="Times New Roman" w:cs="Times New Roman"/>
+                <w:color w:val="000000" w:themeColor="text1"/>
                 <w:sz w:val="22"/>
                 <w:szCs w:val="22"/>
               </w:rPr>
@@ -1027,6 +999,7 @@
             <w:r>
               <w:rPr>
                 <w:rFonts w:ascii="Times New Roman" w:hAnsi="Times New Roman" w:cs="Times New Roman"/>
+                <w:color w:val="000000" w:themeColor="text1"/>
                 <w:sz w:val="22"/>
                 <w:szCs w:val="22"/>
               </w:rPr>
@@ -1052,6 +1025,7 @@
               <w:jc w:val="center"/>
               <w:rPr>
                 <w:rFonts w:ascii="Times New Roman" w:hAnsi="Times New Roman" w:cs="Times New Roman"/>
+                <w:color w:val="000000" w:themeColor="text1"/>
                 <w:sz w:val="22"/>
                 <w:szCs w:val="22"/>
               </w:rPr>
@@ -1059,6 +1033,7 @@
             <w:r>
               <w:rPr>
                 <w:rFonts w:ascii="Times New Roman" w:hAnsi="Times New Roman" w:cs="Times New Roman"/>
+                <w:color w:val="000000" w:themeColor="text1"/>
                 <w:sz w:val="22"/>
                 <w:szCs w:val="22"/>
               </w:rPr>
@@ -1079,6 +1054,7 @@
               <w:jc w:val="center"/>
               <w:rPr>
                 <w:rFonts w:ascii="Times New Roman" w:hAnsi="Times New Roman" w:cs="Times New Roman"/>
+                <w:color w:val="000000" w:themeColor="text1"/>
                 <w:sz w:val="22"/>
                 <w:szCs w:val="22"/>
               </w:rPr>
@@ -1086,6 +1062,7 @@
             <w:r>
               <w:rPr>
                 <w:rFonts w:ascii="Times New Roman" w:hAnsi="Times New Roman" w:cs="Times New Roman"/>
+                <w:color w:val="000000" w:themeColor="text1"/>
                 <w:sz w:val="22"/>
                 <w:szCs w:val="22"/>
               </w:rPr>
@@ -1106,6 +1083,7 @@
               <w:jc w:val="center"/>
               <w:rPr>
                 <w:rFonts w:ascii="Times New Roman" w:hAnsi="Times New Roman" w:cs="Times New Roman"/>
+                <w:color w:val="000000" w:themeColor="text1"/>
                 <w:sz w:val="22"/>
                 <w:szCs w:val="22"/>
               </w:rPr>
@@ -1113,6 +1091,7 @@
             <w:r>
               <w:rPr>
                 <w:rFonts w:ascii="Times New Roman" w:hAnsi="Times New Roman" w:cs="Times New Roman"/>
+                <w:color w:val="000000" w:themeColor="text1"/>
                 <w:sz w:val="22"/>
                 <w:szCs w:val="22"/>
               </w:rPr>
@@ -1122,6 +1101,7 @@
               <w:rPr>
                 <w:rStyle w:val="VerbatimChar"/>
                 <w:rFonts w:ascii="Times New Roman" w:hAnsi="Times New Roman" w:cs="Times New Roman"/>
+                <w:color w:val="000000" w:themeColor="text1"/>
                 <w:szCs w:val="22"/>
               </w:rPr>
               <w:t>/explain</w:t>
@@ -1129,6 +1109,7 @@
             <w:r>
               <w:rPr>
                 <w:rFonts w:ascii="Times New Roman" w:hAnsi="Times New Roman" w:cs="Times New Roman"/>
+                <w:color w:val="000000" w:themeColor="text1"/>
                 <w:sz w:val="22"/>
                 <w:szCs w:val="22"/>
               </w:rPr>
@@ -1138,6 +1119,7 @@
               <w:rPr>
                 <w:rStyle w:val="VerbatimChar"/>
                 <w:rFonts w:ascii="Times New Roman" w:hAnsi="Times New Roman" w:cs="Times New Roman"/>
+                <w:color w:val="000000" w:themeColor="text1"/>
                 <w:szCs w:val="22"/>
               </w:rPr>
               <w:t>/check-assumptions</w:t>
@@ -1145,6 +1127,7 @@
             <w:r>
               <w:rPr>
                 <w:rFonts w:ascii="Times New Roman" w:hAnsi="Times New Roman" w:cs="Times New Roman"/>
+                <w:color w:val="000000" w:themeColor="text1"/>
                 <w:sz w:val="22"/>
                 <w:szCs w:val="22"/>
               </w:rPr>
@@ -1170,6 +1153,7 @@
               <w:jc w:val="center"/>
               <w:rPr>
                 <w:rFonts w:ascii="Times New Roman" w:hAnsi="Times New Roman" w:cs="Times New Roman"/>
+                <w:color w:val="000000" w:themeColor="text1"/>
                 <w:sz w:val="22"/>
                 <w:szCs w:val="22"/>
               </w:rPr>
@@ -1177,6 +1161,7 @@
             <w:r>
               <w:rPr>
                 <w:rFonts w:ascii="Times New Roman" w:hAnsi="Times New Roman" w:cs="Times New Roman"/>
+                <w:color w:val="000000" w:themeColor="text1"/>
                 <w:sz w:val="22"/>
                 <w:szCs w:val="22"/>
               </w:rPr>
@@ -1197,6 +1182,7 @@
               <w:jc w:val="center"/>
               <w:rPr>
                 <w:rFonts w:ascii="Times New Roman" w:hAnsi="Times New Roman" w:cs="Times New Roman"/>
+                <w:color w:val="000000" w:themeColor="text1"/>
                 <w:sz w:val="22"/>
                 <w:szCs w:val="22"/>
               </w:rPr>
@@ -1204,6 +1190,7 @@
             <w:r>
               <w:rPr>
                 <w:rFonts w:ascii="Times New Roman" w:hAnsi="Times New Roman" w:cs="Times New Roman"/>
+                <w:color w:val="000000" w:themeColor="text1"/>
                 <w:sz w:val="22"/>
                 <w:szCs w:val="22"/>
               </w:rPr>
@@ -1224,6 +1211,7 @@
               <w:jc w:val="center"/>
               <w:rPr>
                 <w:rFonts w:ascii="Times New Roman" w:hAnsi="Times New Roman" w:cs="Times New Roman"/>
+                <w:color w:val="000000" w:themeColor="text1"/>
                 <w:sz w:val="22"/>
                 <w:szCs w:val="22"/>
               </w:rPr>
@@ -1231,6 +1219,7 @@
             <w:r>
               <w:rPr>
                 <w:rFonts w:ascii="Times New Roman" w:hAnsi="Times New Roman" w:cs="Times New Roman"/>
+                <w:color w:val="000000" w:themeColor="text1"/>
                 <w:sz w:val="22"/>
                 <w:szCs w:val="22"/>
               </w:rPr>
@@ -1256,6 +1245,7 @@
               <w:jc w:val="center"/>
               <w:rPr>
                 <w:rFonts w:ascii="Times New Roman" w:hAnsi="Times New Roman" w:cs="Times New Roman"/>
+                <w:color w:val="000000" w:themeColor="text1"/>
                 <w:sz w:val="22"/>
                 <w:szCs w:val="22"/>
               </w:rPr>
@@ -1263,6 +1253,7 @@
             <w:r>
               <w:rPr>
                 <w:rFonts w:ascii="Times New Roman" w:hAnsi="Times New Roman" w:cs="Times New Roman"/>
+                <w:color w:val="000000" w:themeColor="text1"/>
                 <w:sz w:val="22"/>
                 <w:szCs w:val="22"/>
               </w:rPr>
@@ -1283,6 +1274,7 @@
               <w:jc w:val="center"/>
               <w:rPr>
                 <w:rFonts w:ascii="Times New Roman" w:hAnsi="Times New Roman" w:cs="Times New Roman"/>
+                <w:color w:val="000000" w:themeColor="text1"/>
                 <w:sz w:val="22"/>
                 <w:szCs w:val="22"/>
               </w:rPr>
@@ -1290,6 +1282,7 @@
             <w:r>
               <w:rPr>
                 <w:rFonts w:ascii="Times New Roman" w:hAnsi="Times New Roman" w:cs="Times New Roman"/>
+                <w:color w:val="000000" w:themeColor="text1"/>
                 <w:sz w:val="22"/>
                 <w:szCs w:val="22"/>
               </w:rPr>
@@ -1310,6 +1303,7 @@
               <w:jc w:val="center"/>
               <w:rPr>
                 <w:rFonts w:ascii="Times New Roman" w:hAnsi="Times New Roman" w:cs="Times New Roman"/>
+                <w:color w:val="000000" w:themeColor="text1"/>
                 <w:sz w:val="22"/>
                 <w:szCs w:val="22"/>
               </w:rPr>
@@ -1317,6 +1311,7 @@
             <w:r>
               <w:rPr>
                 <w:rFonts w:ascii="Times New Roman" w:hAnsi="Times New Roman" w:cs="Times New Roman"/>
+                <w:color w:val="000000" w:themeColor="text1"/>
                 <w:sz w:val="22"/>
                 <w:szCs w:val="22"/>
               </w:rPr>
@@ -1342,6 +1337,7 @@
               <w:jc w:val="center"/>
               <w:rPr>
                 <w:rFonts w:ascii="Times New Roman" w:hAnsi="Times New Roman" w:cs="Times New Roman"/>
+                <w:color w:val="000000" w:themeColor="text1"/>
                 <w:sz w:val="22"/>
                 <w:szCs w:val="22"/>
               </w:rPr>
@@ -1349,6 +1345,7 @@
             <w:r>
               <w:rPr>
                 <w:rFonts w:ascii="Times New Roman" w:hAnsi="Times New Roman" w:cs="Times New Roman"/>
+                <w:color w:val="000000" w:themeColor="text1"/>
                 <w:sz w:val="22"/>
                 <w:szCs w:val="22"/>
               </w:rPr>
@@ -1369,6 +1366,7 @@
               <w:jc w:val="center"/>
               <w:rPr>
                 <w:rFonts w:ascii="Times New Roman" w:hAnsi="Times New Roman" w:cs="Times New Roman"/>
+                <w:color w:val="000000" w:themeColor="text1"/>
                 <w:sz w:val="22"/>
                 <w:szCs w:val="22"/>
               </w:rPr>
@@ -1376,6 +1374,7 @@
             <w:r>
               <w:rPr>
                 <w:rFonts w:ascii="Times New Roman" w:hAnsi="Times New Roman" w:cs="Times New Roman"/>
+                <w:color w:val="000000" w:themeColor="text1"/>
                 <w:sz w:val="22"/>
                 <w:szCs w:val="22"/>
               </w:rPr>
@@ -1396,6 +1395,7 @@
               <w:jc w:val="center"/>
               <w:rPr>
                 <w:rFonts w:ascii="Times New Roman" w:hAnsi="Times New Roman" w:cs="Times New Roman"/>
+                <w:color w:val="000000" w:themeColor="text1"/>
                 <w:sz w:val="22"/>
                 <w:szCs w:val="22"/>
               </w:rPr>
@@ -1403,6 +1403,7 @@
             <w:r>
               <w:rPr>
                 <w:rFonts w:ascii="Times New Roman" w:hAnsi="Times New Roman" w:cs="Times New Roman"/>
+                <w:color w:val="000000" w:themeColor="text1"/>
                 <w:sz w:val="22"/>
                 <w:szCs w:val="22"/>
               </w:rPr>
@@ -1428,6 +1429,7 @@
               <w:jc w:val="center"/>
               <w:rPr>
                 <w:rFonts w:ascii="Times New Roman" w:hAnsi="Times New Roman" w:cs="Times New Roman"/>
+                <w:color w:val="000000" w:themeColor="text1"/>
                 <w:sz w:val="22"/>
                 <w:szCs w:val="22"/>
               </w:rPr>
@@ -1435,6 +1437,7 @@
             <w:r>
               <w:rPr>
                 <w:rFonts w:ascii="Times New Roman" w:hAnsi="Times New Roman" w:cs="Times New Roman"/>
+                <w:color w:val="000000" w:themeColor="text1"/>
                 <w:sz w:val="22"/>
                 <w:szCs w:val="22"/>
               </w:rPr>
@@ -1455,6 +1458,7 @@
               <w:jc w:val="center"/>
               <w:rPr>
                 <w:rFonts w:ascii="Times New Roman" w:hAnsi="Times New Roman" w:cs="Times New Roman"/>
+                <w:color w:val="000000" w:themeColor="text1"/>
                 <w:sz w:val="22"/>
                 <w:szCs w:val="22"/>
               </w:rPr>
@@ -1462,6 +1466,7 @@
             <w:r>
               <w:rPr>
                 <w:rFonts w:ascii="Times New Roman" w:hAnsi="Times New Roman" w:cs="Times New Roman"/>
+                <w:color w:val="000000" w:themeColor="text1"/>
                 <w:sz w:val="22"/>
                 <w:szCs w:val="22"/>
               </w:rPr>
@@ -1482,6 +1487,7 @@
               <w:jc w:val="center"/>
               <w:rPr>
                 <w:rFonts w:ascii="Times New Roman" w:hAnsi="Times New Roman" w:cs="Times New Roman"/>
+                <w:color w:val="000000" w:themeColor="text1"/>
                 <w:sz w:val="22"/>
                 <w:szCs w:val="22"/>
               </w:rPr>
@@ -1489,10 +1495,11 @@
             <w:r>
               <w:rPr>
                 <w:rFonts w:ascii="Times New Roman" w:hAnsi="Times New Roman" w:cs="Times New Roman"/>
-                <w:sz w:val="22"/>
-                <w:szCs w:val="22"/>
-              </w:rPr>
-              <w:t>Build-and-validate project; the presentation centers on the verification story</w:t>
+                <w:color w:val="000000" w:themeColor="text1"/>
+                <w:sz w:val="22"/>
+                <w:szCs w:val="22"/>
+              </w:rPr>
+              <w:t xml:space="preserve">Show off what you’ve built. </w:t>
             </w:r>
           </w:p>
         </w:tc>
@@ -1505,6 +1512,7 @@
         <w:spacing w:before="0" w:after="0"/>
         <w:rPr>
           <w:rFonts w:ascii="Times New Roman" w:hAnsi="Times New Roman" w:cs="Times New Roman"/>
+          <w:color w:val="000000" w:themeColor="text1"/>
           <w:sz w:val="24"/>
           <w:szCs w:val="24"/>
         </w:rPr>
@@ -1519,6 +1527,7 @@
         <w:spacing w:before="0" w:after="0"/>
         <w:rPr>
           <w:rFonts w:ascii="Times New Roman" w:hAnsi="Times New Roman" w:cs="Times New Roman"/>
+          <w:color w:val="000000" w:themeColor="text1"/>
           <w:sz w:val="24"/>
           <w:szCs w:val="24"/>
         </w:rPr>
@@ -1526,6 +1535,7 @@
       <w:r>
         <w:rPr>
           <w:rFonts w:ascii="Times New Roman" w:hAnsi="Times New Roman" w:cs="Times New Roman"/>
+          <w:color w:val="000000" w:themeColor="text1"/>
           <w:sz w:val="24"/>
           <w:szCs w:val="24"/>
         </w:rPr>
@@ -1535,6 +1545,7 @@
         <w:rPr>
           <w:rStyle w:val="VerbatimChar"/>
           <w:rFonts w:ascii="Times New Roman" w:hAnsi="Times New Roman" w:cs="Times New Roman"/>
+          <w:color w:val="000000" w:themeColor="text1"/>
           <w:sz w:val="24"/>
           <w:szCs w:val="24"/>
         </w:rPr>
@@ -1543,6 +1554,7 @@
       <w:r>
         <w:rPr>
           <w:rFonts w:ascii="Times New Roman" w:hAnsi="Times New Roman" w:cs="Times New Roman"/>
+          <w:color w:val="000000" w:themeColor="text1"/>
           <w:sz w:val="24"/>
           <w:szCs w:val="24"/>
         </w:rPr>
@@ -1560,12 +1572,14 @@
         <w:spacing w:before="0" w:after="0"/>
         <w:rPr>
           <w:rFonts w:ascii="Times New Roman" w:hAnsi="Times New Roman" w:cs="Times New Roman"/>
+          <w:color w:val="000000" w:themeColor="text1"/>
         </w:rPr>
       </w:pPr>
       <w:r>
         <w:rPr>
           <w:rStyle w:val="VerbatimChar"/>
           <w:rFonts w:ascii="Times New Roman" w:hAnsi="Times New Roman" w:cs="Times New Roman"/>
+          <w:color w:val="000000" w:themeColor="text1"/>
           <w:sz w:val="24"/>
         </w:rPr>
         <w:t>/</w:t>
@@ -1575,6 +1589,7 @@
         <w:rPr>
           <w:rStyle w:val="VerbatimChar"/>
           <w:rFonts w:ascii="Times New Roman" w:hAnsi="Times New Roman" w:cs="Times New Roman"/>
+          <w:color w:val="000000" w:themeColor="text1"/>
           <w:sz w:val="24"/>
         </w:rPr>
         <w:t>explain</w:t>
@@ -1583,6 +1598,7 @@
       <w:r>
         <w:rPr>
           <w:rFonts w:ascii="Times New Roman" w:hAnsi="Times New Roman" w:cs="Times New Roman"/>
+          <w:color w:val="000000" w:themeColor="text1"/>
         </w:rPr>
         <w:t xml:space="preserve"> - turns the agent into a tutor for the current repo (any depth, can quiz)</w:t>
       </w:r>
@@ -1598,12 +1614,14 @@
         <w:spacing w:before="0" w:after="0"/>
         <w:rPr>
           <w:rFonts w:ascii="Times New Roman" w:hAnsi="Times New Roman" w:cs="Times New Roman"/>
+          <w:color w:val="000000" w:themeColor="text1"/>
         </w:rPr>
       </w:pPr>
       <w:r>
         <w:rPr>
           <w:rStyle w:val="VerbatimChar"/>
           <w:rFonts w:ascii="Times New Roman" w:hAnsi="Times New Roman" w:cs="Times New Roman"/>
+          <w:color w:val="000000" w:themeColor="text1"/>
           <w:sz w:val="24"/>
         </w:rPr>
         <w:t>/</w:t>
@@ -1613,6 +1631,7 @@
         <w:rPr>
           <w:rStyle w:val="VerbatimChar"/>
           <w:rFonts w:ascii="Times New Roman" w:hAnsi="Times New Roman" w:cs="Times New Roman"/>
+          <w:color w:val="000000" w:themeColor="text1"/>
           <w:sz w:val="24"/>
         </w:rPr>
         <w:t>check</w:t>
@@ -1622,6 +1641,7 @@
         <w:rPr>
           <w:rStyle w:val="VerbatimChar"/>
           <w:rFonts w:ascii="Times New Roman" w:hAnsi="Times New Roman" w:cs="Times New Roman"/>
+          <w:color w:val="000000" w:themeColor="text1"/>
           <w:sz w:val="24"/>
         </w:rPr>
         <w:t>-assumptions</w:t>
@@ -1629,6 +1649,7 @@
       <w:r>
         <w:rPr>
           <w:rFonts w:ascii="Times New Roman" w:hAnsi="Times New Roman" w:cs="Times New Roman"/>
+          <w:color w:val="000000" w:themeColor="text1"/>
         </w:rPr>
         <w:t xml:space="preserve"> - forces assumption checks before reporting any statistical result</w:t>
       </w:r>
@@ -1644,11 +1665,13 @@
         <w:spacing w:before="0" w:after="0"/>
         <w:rPr>
           <w:rFonts w:ascii="Times New Roman" w:hAnsi="Times New Roman" w:cs="Times New Roman"/>
-        </w:rPr>
-      </w:pPr>
-      <w:r>
-        <w:rPr>
-          <w:rFonts w:ascii="Times New Roman" w:hAnsi="Times New Roman" w:cs="Times New Roman"/>
+          <w:color w:val="000000" w:themeColor="text1"/>
+        </w:rPr>
+      </w:pPr>
+      <w:r>
+        <w:rPr>
+          <w:rFonts w:ascii="Times New Roman" w:hAnsi="Times New Roman" w:cs="Times New Roman"/>
+          <w:color w:val="000000" w:themeColor="text1"/>
         </w:rPr>
         <w:t>More added as the series progresses (Weeks 6-9)</w:t>
       </w:r>
@@ -1660,6 +1683,7 @@
         <w:spacing w:before="0" w:after="0"/>
         <w:rPr>
           <w:rFonts w:ascii="Times New Roman" w:hAnsi="Times New Roman" w:cs="Times New Roman"/>
+          <w:color w:val="000000" w:themeColor="text1"/>
           <w:sz w:val="24"/>
           <w:szCs w:val="24"/>
         </w:rPr>
@@ -1674,6 +1698,7 @@
         <w:spacing w:before="0" w:after="0"/>
         <w:rPr>
           <w:rFonts w:ascii="Times New Roman" w:hAnsi="Times New Roman" w:cs="Times New Roman"/>
+          <w:color w:val="000000" w:themeColor="text1"/>
           <w:sz w:val="24"/>
           <w:szCs w:val="24"/>
         </w:rPr>
@@ -1681,6 +1706,7 @@
       <w:r>
         <w:rPr>
           <w:rFonts w:ascii="Times New Roman" w:hAnsi="Times New Roman" w:cs="Times New Roman"/>
+          <w:color w:val="000000" w:themeColor="text1"/>
           <w:sz w:val="24"/>
           <w:szCs w:val="24"/>
         </w:rPr>
@@ -1698,11 +1724,13 @@
         <w:spacing w:before="0" w:after="0"/>
         <w:rPr>
           <w:rFonts w:ascii="Times New Roman" w:hAnsi="Times New Roman" w:cs="Times New Roman"/>
-        </w:rPr>
-      </w:pPr>
-      <w:r>
-        <w:rPr>
-          <w:rFonts w:ascii="Times New Roman" w:hAnsi="Times New Roman" w:cs="Times New Roman"/>
+          <w:color w:val="000000" w:themeColor="text1"/>
+        </w:rPr>
+      </w:pPr>
+      <w:r>
+        <w:rPr>
+          <w:rFonts w:ascii="Times New Roman" w:hAnsi="Times New Roman" w:cs="Times New Roman"/>
+          <w:color w:val="000000" w:themeColor="text1"/>
         </w:rPr>
         <w:t>One folder per week (</w:t>
       </w:r>
@@ -1710,6 +1738,7 @@
         <w:rPr>
           <w:rStyle w:val="VerbatimChar"/>
           <w:rFonts w:ascii="Times New Roman" w:hAnsi="Times New Roman" w:cs="Times New Roman"/>
+          <w:color w:val="000000" w:themeColor="text1"/>
           <w:sz w:val="24"/>
         </w:rPr>
         <w:t>week-01-...</w:t>
@@ -1717,6 +1746,7 @@
       <w:r>
         <w:rPr>
           <w:rFonts w:ascii="Times New Roman" w:hAnsi="Times New Roman" w:cs="Times New Roman"/>
+          <w:color w:val="000000" w:themeColor="text1"/>
         </w:rPr>
         <w:t xml:space="preserve"> through </w:t>
       </w:r>
@@ -1724,6 +1754,7 @@
         <w:rPr>
           <w:rStyle w:val="VerbatimChar"/>
           <w:rFonts w:ascii="Times New Roman" w:hAnsi="Times New Roman" w:cs="Times New Roman"/>
+          <w:color w:val="000000" w:themeColor="text1"/>
           <w:sz w:val="24"/>
         </w:rPr>
         <w:t>week-10-...</w:t>
@@ -1731,6 +1762,7 @@
       <w:r>
         <w:rPr>
           <w:rFonts w:ascii="Times New Roman" w:hAnsi="Times New Roman" w:cs="Times New Roman"/>
+          <w:color w:val="000000" w:themeColor="text1"/>
         </w:rPr>
         <w:t>) with materials, exercises, and notes.</w:t>
       </w:r>
@@ -1746,12 +1778,14 @@
         <w:spacing w:before="0" w:after="0"/>
         <w:rPr>
           <w:rFonts w:ascii="Times New Roman" w:hAnsi="Times New Roman" w:cs="Times New Roman"/>
+          <w:color w:val="000000" w:themeColor="text1"/>
         </w:rPr>
       </w:pPr>
       <w:r>
         <w:rPr>
           <w:rStyle w:val="VerbatimChar"/>
           <w:rFonts w:ascii="Times New Roman" w:hAnsi="Times New Roman" w:cs="Times New Roman"/>
+          <w:color w:val="000000" w:themeColor="text1"/>
           <w:sz w:val="24"/>
         </w:rPr>
         <w:t>skills/</w:t>
@@ -1759,6 +1793,7 @@
       <w:r>
         <w:rPr>
           <w:rFonts w:ascii="Times New Roman" w:hAnsi="Times New Roman" w:cs="Times New Roman"/>
+          <w:color w:val="000000" w:themeColor="text1"/>
         </w:rPr>
         <w:t xml:space="preserve"> - the take-home, downloadable skills.</w:t>
       </w:r>
@@ -1774,12 +1809,14 @@
         <w:spacing w:before="0" w:after="0"/>
         <w:rPr>
           <w:rFonts w:ascii="Times New Roman" w:hAnsi="Times New Roman" w:cs="Times New Roman"/>
+          <w:color w:val="000000" w:themeColor="text1"/>
         </w:rPr>
       </w:pPr>
       <w:r>
         <w:rPr>
           <w:rStyle w:val="VerbatimChar"/>
           <w:rFonts w:ascii="Times New Roman" w:hAnsi="Times New Roman" w:cs="Times New Roman"/>
+          <w:color w:val="000000" w:themeColor="text1"/>
           <w:sz w:val="24"/>
         </w:rPr>
         <w:t>resources/</w:t>
@@ -1787,6 +1824,7 @@
       <w:r>
         <w:rPr>
           <w:rFonts w:ascii="Times New Roman" w:hAnsi="Times New Roman" w:cs="Times New Roman"/>
+          <w:color w:val="000000" w:themeColor="text1"/>
         </w:rPr>
         <w:t xml:space="preserve"> - shared references, datasets, and supplemental reading.</w:t>
       </w:r>

</xml_diff>

<commit_message>
Update syllabus docx: full take-home skills list and week-09 folder range
Surgical XML edit; preserves existing formatting.

Co-Authored-By: Claude Opus 4.8 (1M context) <noreply@anthropic.com>
</commit_message>
<xml_diff>
--- a/Summer of Claude.docx
+++ b/Summer of Claude.docx
@@ -1673,7 +1673,7 @@
           <w:rFonts w:ascii="Times New Roman" w:hAnsi="Times New Roman" w:cs="Times New Roman"/>
           <w:color w:val="000000" w:themeColor="text1"/>
         </w:rPr>
-        <w:t>More added as the series progresses (Weeks 6-9)</w:t>
+        <w:t>git-workflow, test-first, and challenge-result, plus AGENTS.md / CLAUDE.md and hook templates</w:t>
       </w:r>
     </w:p>
     <w:p>
@@ -1757,7 +1757,7 @@
           <w:color w:val="000000" w:themeColor="text1"/>
           <w:sz w:val="24"/>
         </w:rPr>
-        <w:t>week-10-...</w:t>
+        <w:t>week-09-...</w:t>
       </w:r>
       <w:r>
         <w:rPr>

</xml_diff>

<commit_message>
Syllabus docx: list all five take-home skills as separate bullets
Co-Authored-By: Claude Opus 4.8 (1M context) <noreply@anthropic.com>
</commit_message>
<xml_diff>
--- a/Summer of Claude.docx
+++ b/Summer of Claude.docx
@@ -1577,30 +1577,10 @@
       </w:pPr>
       <w:r>
         <w:rPr>
-          <w:rStyle w:val="VerbatimChar"/>
-          <w:rFonts w:ascii="Times New Roman" w:hAnsi="Times New Roman" w:cs="Times New Roman"/>
-          <w:color w:val="000000" w:themeColor="text1"/>
-          <w:sz w:val="24"/>
-        </w:rPr>
-        <w:t>/</w:t>
-      </w:r>
-      <w:proofErr w:type="gramStart"/>
-      <w:r>
-        <w:rPr>
-          <w:rStyle w:val="VerbatimChar"/>
-          <w:rFonts w:ascii="Times New Roman" w:hAnsi="Times New Roman" w:cs="Times New Roman"/>
-          <w:color w:val="000000" w:themeColor="text1"/>
-          <w:sz w:val="24"/>
-        </w:rPr>
-        <w:t>explain</w:t>
-      </w:r>
-      <w:proofErr w:type="gramEnd"/>
-      <w:r>
-        <w:rPr>
-          <w:rFonts w:ascii="Times New Roman" w:hAnsi="Times New Roman" w:cs="Times New Roman"/>
-          <w:color w:val="000000" w:themeColor="text1"/>
-        </w:rPr>
-        <w:t xml:space="preserve"> - turns the agent into a tutor for the current repo (any depth, can quiz)</w:t>
+          <w:rFonts w:ascii="Times New Roman" w:hAnsi="Times New Roman" w:cs="Times New Roman"/>
+          <w:color w:val="000000" w:themeColor="text1"/>
+        </w:rPr>
+        <w:t xml:space="preserve">git-workflow - keep main stable, work on a branch, and review every diff before committing</w:t>
       </w:r>
     </w:p>
     <w:p>
@@ -1619,39 +1599,10 @@
       </w:pPr>
       <w:r>
         <w:rPr>
-          <w:rStyle w:val="VerbatimChar"/>
-          <w:rFonts w:ascii="Times New Roman" w:hAnsi="Times New Roman" w:cs="Times New Roman"/>
-          <w:color w:val="000000" w:themeColor="text1"/>
-          <w:sz w:val="24"/>
-        </w:rPr>
-        <w:t>/</w:t>
-      </w:r>
-      <w:proofErr w:type="gramStart"/>
-      <w:r>
-        <w:rPr>
-          <w:rStyle w:val="VerbatimChar"/>
-          <w:rFonts w:ascii="Times New Roman" w:hAnsi="Times New Roman" w:cs="Times New Roman"/>
-          <w:color w:val="000000" w:themeColor="text1"/>
-          <w:sz w:val="24"/>
-        </w:rPr>
-        <w:t>check</w:t>
-      </w:r>
-      <w:proofErr w:type="gramEnd"/>
-      <w:r>
-        <w:rPr>
-          <w:rStyle w:val="VerbatimChar"/>
-          <w:rFonts w:ascii="Times New Roman" w:hAnsi="Times New Roman" w:cs="Times New Roman"/>
-          <w:color w:val="000000" w:themeColor="text1"/>
-          <w:sz w:val="24"/>
-        </w:rPr>
-        <w:t>-assumptions</w:t>
-      </w:r>
-      <w:r>
-        <w:rPr>
-          <w:rFonts w:ascii="Times New Roman" w:hAnsi="Times New Roman" w:cs="Times New Roman"/>
-          <w:color w:val="000000" w:themeColor="text1"/>
-        </w:rPr>
-        <w:t xml:space="preserve"> - forces assumption checks before reporting any statistical result</w:t>
+          <w:rFonts w:ascii="Times New Roman" w:hAnsi="Times New Roman" w:cs="Times New Roman"/>
+          <w:color w:val="000000" w:themeColor="text1"/>
+        </w:rPr>
+        <w:t xml:space="preserve">/explain - turns the agent into a tutor for the current repo (any depth, can quiz)</w:t>
       </w:r>
     </w:p>
     <w:p>
@@ -1673,7 +1624,51 @@
           <w:rFonts w:ascii="Times New Roman" w:hAnsi="Times New Roman" w:cs="Times New Roman"/>
           <w:color w:val="000000" w:themeColor="text1"/>
         </w:rPr>
-        <w:t>git-workflow, test-first, and challenge-result, plus AGENTS.md / CLAUDE.md and hook templates</w:t>
+        <w:t xml:space="preserve">/check-assumptions - forces assumption checks before reporting any statistical result</w:t>
+      </w:r>
+    </w:p>
+    <w:p>
+      <w:pPr>
+        <w:pStyle w:val="Compact"/>
+        <w:numPr>
+          <w:ilvl w:val="0"/>
+          <w:numId w:val="3"/>
+        </w:numPr>
+        <w:snapToGrid w:val="0"/>
+        <w:spacing w:before="0" w:after="0"/>
+        <w:rPr>
+          <w:rFonts w:ascii="Times New Roman" w:hAnsi="Times New Roman" w:cs="Times New Roman"/>
+          <w:color w:val="000000" w:themeColor="text1"/>
+        </w:rPr>
+      </w:pPr>
+      <w:r>
+        <w:rPr>
+          <w:rFonts w:ascii="Times New Roman" w:hAnsi="Times New Roman" w:cs="Times New Roman"/>
+          <w:color w:val="000000" w:themeColor="text1"/>
+        </w:rPr>
+        <w:t xml:space="preserve">test-first - write the test before the code, so a bug and a test that hides it are not written together</w:t>
+      </w:r>
+    </w:p>
+    <w:p>
+      <w:pPr>
+        <w:pStyle w:val="Compact"/>
+        <w:numPr>
+          <w:ilvl w:val="0"/>
+          <w:numId w:val="3"/>
+        </w:numPr>
+        <w:snapToGrid w:val="0"/>
+        <w:spacing w:before="0" w:after="0"/>
+        <w:rPr>
+          <w:rFonts w:ascii="Times New Roman" w:hAnsi="Times New Roman" w:cs="Times New Roman"/>
+          <w:color w:val="000000" w:themeColor="text1"/>
+        </w:rPr>
+      </w:pPr>
+      <w:r>
+        <w:rPr>
+          <w:rFonts w:ascii="Times New Roman" w:hAnsi="Times New Roman" w:cs="Times New Roman"/>
+          <w:color w:val="000000" w:themeColor="text1"/>
+        </w:rPr>
+        <w:t xml:space="preserve">challenge-result - tries to prove a result wrong before you trust it</w:t>
       </w:r>
     </w:p>
     <w:p>

</xml_diff>